<commit_message>
refactor: remove diet options display from estimate document generation
</commit_message>
<xml_diff>
--- a/REFACTOR_TEST_RESULT.docx
+++ b/REFACTOR_TEST_RESULT.docx
@@ -300,6 +300,14 @@
       <w:tblPr>
         <w:tblStyle w:val="Tablaconcuadrcula"/>
         <w:tblW w:w="0" w:type="auto"/>
+        <w:tblBorders>
+          <w:top w:val="none" w:sz="0" w:space="0" w:color="auto"/>
+          <w:left w:val="none" w:sz="0" w:space="0" w:color="auto"/>
+          <w:bottom w:val="none" w:sz="0" w:space="0" w:color="auto"/>
+          <w:right w:val="none" w:sz="0" w:space="0" w:color="auto"/>
+          <w:insideH w:val="none" w:sz="0" w:space="0" w:color="auto"/>
+          <w:insideV w:val="none" w:sz="0" w:space="0" w:color="auto"/>
+        </w:tblBorders>
         <w:tblLook w:val="04A0" w:firstRow="1" w:lastRow="0" w:firstColumn="1" w:lastColumn="0" w:noHBand="0" w:noVBand="1"/>
       </w:tblPr>
       <w:tblGrid>
@@ -395,7 +403,7 @@
             </w:pPr>
             <w:r>
               <w:rPr>
-                <w:rFonts w:ascii="Cambria" w:hAnsi="Cambria"/>
+                <w:rFonts w:ascii="Open Sans" w:hAnsi="Open Sans" w:cs="Open Sans"/>
                 <w:color w:val="000000"/>
                 <w:sz w:val="18"/>
                 <w:lang w:val="en-US"/>
@@ -412,6 +420,7 @@
             </w:pPr>
             <w:r>
               <w:rPr>
+                <w:rFonts w:ascii="Open Sans" w:hAnsi="Open Sans" w:cs="Open Sans"/>
                 <w:sz w:val="20"/>
                 <w:lang w:val="en-US"/>
               </w:rPr>
@@ -427,6 +436,7 @@
             </w:pPr>
             <w:r>
               <w:rPr>
+                <w:rFonts w:ascii="Open Sans" w:hAnsi="Open Sans" w:cs="Open Sans"/>
                 <w:sz w:val="20"/>
                 <w:lang w:val="en-US"/>
               </w:rPr>
@@ -464,6 +474,7 @@
             </w:pPr>
             <w:r>
               <w:rPr>
+                <w:rFonts w:ascii="Open Sans" w:hAnsi="Open Sans" w:cs="Open Sans"/>
                 <w:sz w:val="20"/>
                 <w:lang w:val="en-US"/>
               </w:rPr>
@@ -479,6 +490,7 @@
             </w:pPr>
             <w:r>
               <w:rPr>
+                <w:rFonts w:ascii="Open Sans" w:hAnsi="Open Sans" w:cs="Open Sans"/>
                 <w:sz w:val="20"/>
                 <w:lang w:val="en-US"/>
               </w:rPr>
@@ -494,6 +506,7 @@
             </w:pPr>
             <w:r>
               <w:rPr>
+                <w:rFonts w:ascii="Open Sans" w:hAnsi="Open Sans" w:cs="Open Sans"/>
                 <w:sz w:val="20"/>
                 <w:lang w:val="en-US"/>
               </w:rPr>
@@ -531,6 +544,7 @@
             </w:pPr>
             <w:r>
               <w:rPr>
+                <w:rFonts w:ascii="Open Sans" w:hAnsi="Open Sans" w:cs="Open Sans"/>
                 <w:sz w:val="20"/>
                 <w:lang w:val="en-US"/>
               </w:rPr>
@@ -546,6 +560,7 @@
             </w:pPr>
             <w:r>
               <w:rPr>
+                <w:rFonts w:ascii="Open Sans" w:hAnsi="Open Sans" w:cs="Open Sans"/>
                 <w:sz w:val="20"/>
                 <w:lang w:val="en-US"/>
               </w:rPr>
@@ -561,6 +576,7 @@
             </w:pPr>
             <w:r>
               <w:rPr>
+                <w:rFonts w:ascii="Open Sans" w:hAnsi="Open Sans" w:cs="Open Sans"/>
                 <w:sz w:val="20"/>
                 <w:lang w:val="en-US"/>
               </w:rPr>
@@ -576,6 +592,7 @@
             </w:pPr>
             <w:r>
               <w:rPr>
+                <w:rFonts w:ascii="Open Sans" w:hAnsi="Open Sans" w:cs="Open Sans"/>
                 <w:sz w:val="20"/>
                 <w:lang w:val="en-US"/>
               </w:rPr>
@@ -583,6 +600,7 @@
             </w:r>
             <w:r>
               <w:rPr>
+                <w:rFonts w:ascii="Open Sans" w:hAnsi="Open Sans" w:cs="Open Sans"/>
                 <w:sz w:val="20"/>
                 <w:lang w:val="en-US"/>
               </w:rPr>
@@ -737,7 +755,7 @@
             </w:pPr>
             <w:r>
               <w:rPr>
-                <w:rFonts w:ascii="Open Sans Medium" w:hAnsi="Open Sans Medium" w:cs="Open Sans Medium"/>
+                <w:rFonts w:ascii="Open Sans" w:hAnsi="Open Sans" w:cs="Open Sans"/>
                 <w:color w:val="323232"/>
                 <w:sz w:val="20"/>
                 <w:szCs w:val="20"/>
@@ -954,7 +972,7 @@
             </w:pPr>
             <w:r>
               <w:rPr>
-                <w:rFonts w:ascii="Open Sans Medium" w:eastAsiaTheme="minorEastAsia" w:hAnsi="Open Sans Medium" w:cs="Open Sans Medium"/>
+                <w:rFonts w:ascii="Open Sans" w:eastAsiaTheme="minorEastAsia" w:hAnsi="Open Sans" w:cs="Open Sans"/>
                 <w:color w:val="323232"/>
                 <w:sz w:val="20"/>
                 <w:szCs w:val="20"/>
@@ -1002,14 +1020,13 @@
       </w:pPr>
       <w:r>
         <w:rPr>
-          <w:rFonts w:asciiTheme="minorHAnsi" w:hAnsiTheme="minorHAnsi"/>
+          <w:rFonts w:asciiTheme="minorHAnsi" w:hAnsiTheme="minorHAnsi" w:ascii="Open Sans" w:hAnsi="Open Sans" w:cs="Open Sans"/>
           <w:color w:val="501549" w:themeColor="accent5" w:themeShade="80"/>
           <w:sz w:val="22"/>
           <w:szCs w:val="22"/>
           <w:lang w:val="en-US"/>
         </w:rPr>
-        <w:lastRenderedPageBreak/>
-        <w:t xml:space="preserve">SIMONS SOCIETY OF FELLOWS DINNER </w:t>
+        <w:t>Simons Foundation</w:t>
       </w:r>
     </w:p>
     <w:p>
@@ -1023,11 +1040,12 @@
       </w:pPr>
       <w:r>
         <w:rPr>
+          <w:rFonts w:ascii="Open Sans" w:hAnsi="Open Sans" w:cs="Open Sans"/>
           <w:sz w:val="20"/>
           <w:szCs w:val="20"/>
           <w:lang w:val="en-US"/>
         </w:rPr>
-        <w:t xml:space="preserve">160 5th Ave #2nd, New York, NY 10010, USA </w:t>
+        <w:t>160 5th Ave, New York</w:t>
       </w:r>
     </w:p>
     <w:p>
@@ -1057,6 +1075,7 @@
       </w:r>
       <w:r>
         <w:rPr>
+          <w:rFonts w:ascii="Open Sans" w:hAnsi="Open Sans" w:cs="Open Sans"/>
           <w:sz w:val="20"/>
           <w:lang w:val="en-US"/>
         </w:rPr>
@@ -1072,6 +1091,7 @@
       </w:pPr>
       <w:r>
         <w:rPr>
+          <w:rFonts w:ascii="Open Sans" w:hAnsi="Open Sans" w:cs="Open Sans"/>
           <w:sz w:val="20"/>
           <w:lang w:val="en-US"/>
         </w:rPr>
@@ -1105,6 +1125,7 @@
       </w:r>
       <w:r>
         <w:rPr>
+          <w:rFonts w:ascii="Open Sans" w:hAnsi="Open Sans" w:cs="Open Sans"/>
           <w:sz w:val="20"/>
           <w:lang w:val="en-US"/>
         </w:rPr>
@@ -1140,6 +1161,7 @@
       </w:r>
       <w:r>
         <w:rPr>
+          <w:rFonts w:ascii="Open Sans" w:hAnsi="Open Sans" w:cs="Open Sans"/>
           <w:sz w:val="20"/>
           <w:lang w:val="en-US"/>
         </w:rPr>
@@ -1175,6 +1197,7 @@
       </w:r>
       <w:r>
         <w:rPr>
+          <w:rFonts w:ascii="Open Sans" w:hAnsi="Open Sans" w:cs="Open Sans"/>
           <w:sz w:val="20"/>
           <w:lang w:val="en-US"/>
         </w:rPr>
@@ -1210,6 +1233,7 @@
       </w:r>
       <w:r>
         <w:rPr>
+          <w:rFonts w:ascii="Open Sans" w:hAnsi="Open Sans" w:cs="Open Sans"/>
           <w:sz w:val="20"/>
           <w:lang w:val="en-US"/>
         </w:rPr>
@@ -1232,11 +1256,12 @@
       </w:pPr>
       <w:r>
         <w:rPr>
-          <w:rFonts w:ascii="Open Sans" w:hAnsi="Open Sans"/>
+          <w:rFonts w:ascii="Open Sans" w:hAnsi="Open Sans" w:cs="Open Sans"/>
           <w:b/>
           <w:i w:val="0"/>
           <w:color w:val="612D4B"/>
           <w:sz w:val="28"/>
+          <w:u w:val="none"/>
         </w:rPr>
         <w:t>MENUS</w:t>
       </w:r>
@@ -1247,11 +1272,12 @@
       </w:pPr>
       <w:r>
         <w:rPr>
-          <w:rFonts w:ascii="Open Sans" w:hAnsi="Open Sans"/>
+          <w:rFonts w:ascii="Open Sans" w:hAnsi="Open Sans" w:cs="Open Sans"/>
           <w:b w:val="0"/>
           <w:i w:val="0"/>
           <w:color w:val="333333"/>
           <w:sz w:val="22"/>
+          <w:u w:val="none"/>
         </w:rPr>
         <w:t>Wednesday, April 29th 2026</w:t>
       </w:r>
@@ -1260,6 +1286,16 @@
       <w:pPr>
         <w:spacing w:after="120" w:before="0"/>
       </w:pPr>
+      <w:r>
+        <w:rPr>
+          <w:rFonts w:ascii="Open Sans" w:hAnsi="Open Sans" w:cs="Open Sans"/>
+          <w:b w:val="0"/>
+          <w:i w:val="0"/>
+          <w:color w:val="333333"/>
+          <w:sz w:val="22"/>
+          <w:u w:val="none"/>
+        </w:rPr>
+      </w:r>
     </w:p>
     <w:p>
       <w:pPr>
@@ -1267,11 +1303,12 @@
       </w:pPr>
       <w:r>
         <w:rPr>
-          <w:rFonts w:ascii="Open Sans" w:hAnsi="Open Sans"/>
+          <w:rFonts w:ascii="Open Sans" w:hAnsi="Open Sans" w:cs="Open Sans"/>
           <w:b/>
           <w:i w:val="0"/>
           <w:color w:val="612D4B"/>
           <w:sz w:val="24"/>
+          <w:u w:val="none"/>
         </w:rPr>
         <w:t>Dietary Restrictions</w:t>
       </w:r>
@@ -1282,22 +1319,33 @@
       </w:pPr>
       <w:r>
         <w:rPr>
-          <w:rFonts w:ascii="Open Sans" w:hAnsi="Open Sans"/>
+          <w:rFonts w:ascii="Open Sans" w:hAnsi="Open Sans" w:cs="Open Sans"/>
           <w:b w:val="0"/>
           <w:i w:val="0"/>
           <w:color w:val="333333"/>
           <w:sz w:val="22"/>
+          <w:u w:val="none"/>
         </w:rPr>
         <w:t>Vegan / Vegetarian options included for all courses.</w:t>
       </w:r>
     </w:p>
     <w:p>
       <w:pPr>
-        <w:spacing w:after="40" w:before="240"/>
         <w:pBdr>
           <w:bottom w:val="single" w:sz="6" w:space="1" w:color="000000"/>
         </w:pBdr>
-      </w:pPr>
+        <w:spacing w:after="40" w:before="240"/>
+      </w:pPr>
+      <w:r>
+        <w:rPr>
+          <w:rFonts w:ascii="Open Sans" w:hAnsi="Open Sans" w:cs="Open Sans"/>
+          <w:b w:val="0"/>
+          <w:i w:val="0"/>
+          <w:color w:val="333333"/>
+          <w:sz w:val="22"/>
+          <w:u w:val="none"/>
+        </w:rPr>
+      </w:r>
     </w:p>
     <w:p>
       <w:pPr>
@@ -1305,11 +1353,12 @@
       </w:pPr>
       <w:r>
         <w:rPr>
-          <w:rFonts w:ascii="Open Sans" w:hAnsi="Open Sans"/>
+          <w:rFonts w:ascii="Open Sans" w:hAnsi="Open Sans" w:cs="Open Sans"/>
           <w:b/>
           <w:i w:val="0"/>
           <w:color w:val="333333"/>
           <w:sz w:val="22"/>
+          <w:u w:val="none"/>
         </w:rPr>
         <w:t>Wednesday, April 29th, 2026</w:t>
       </w:r>
@@ -1320,11 +1369,12 @@
       </w:pPr>
       <w:r>
         <w:rPr>
-          <w:rFonts w:ascii="Open Sans" w:hAnsi="Open Sans"/>
+          <w:rFonts w:ascii="Open Sans" w:hAnsi="Open Sans" w:cs="Open Sans"/>
           <w:b/>
           <w:i w:val="0"/>
           <w:color w:val="612D4B"/>
-          <w:sz w:val="28"/>
+          <w:sz w:val="27"/>
+          <w:u w:val="none"/>
         </w:rPr>
         <w:t>HORS D'OEUVRES: 7:00 PM to 7:45 PM</w:t>
       </w:r>
@@ -1335,29 +1385,79 @@
       </w:pPr>
       <w:r>
         <w:rPr>
-          <w:rFonts w:ascii="Open Sans" w:hAnsi="Open Sans"/>
+          <w:rFonts w:ascii="Open Sans" w:hAnsi="Open Sans" w:cs="Open Sans"/>
           <w:b w:val="0"/>
           <w:i/>
           <w:color w:val="333333"/>
           <w:sz w:val="22"/>
+          <w:u w:val="none"/>
         </w:rPr>
         <w:t>Passed selection</w:t>
       </w:r>
     </w:p>
     <w:p>
       <w:pPr>
-        <w:spacing w:after="120" w:before="120"/>
-      </w:pPr>
-      <w:r>
-        <w:rPr>
-          <w:rFonts w:ascii="Open Sans" w:hAnsi="Open Sans"/>
+        <w:pBdr>
+          <w:bottom w:val="single" w:sz="6" w:space="1" w:color="000000"/>
+        </w:pBdr>
+        <w:spacing w:after="40" w:before="240"/>
+      </w:pPr>
+      <w:r>
+        <w:rPr>
+          <w:rFonts w:ascii="Open Sans" w:hAnsi="Open Sans" w:cs="Open Sans"/>
+          <w:b w:val="0"/>
+          <w:i w:val="0"/>
+          <w:color w:val="333333"/>
+          <w:sz w:val="22"/>
+          <w:u w:val="none"/>
+        </w:rPr>
+      </w:r>
+    </w:p>
+    <w:p>
+      <w:pPr>
+        <w:spacing w:after="120" w:before="160"/>
+      </w:pPr>
+      <w:r>
+        <w:rPr>
+          <w:rFonts w:ascii="Open Sans" w:hAnsi="Open Sans" w:cs="Open Sans"/>
           <w:b/>
           <w:i w:val="0"/>
+          <w:color w:val="612D4B"/>
+          <w:sz w:val="27"/>
+          <w:u w:val="none"/>
+        </w:rPr>
+        <w:t>PLATED DINNER: 7:45 PM to 9:30 PM</w:t>
+      </w:r>
+    </w:p>
+    <w:p>
+      <w:pPr>
+        <w:spacing w:after="120" w:before="0"/>
+      </w:pPr>
+      <w:r>
+        <w:rPr>
+          <w:rFonts w:ascii="Open Sans" w:hAnsi="Open Sans" w:cs="Open Sans"/>
+          <w:b w:val="0"/>
+          <w:i/>
           <w:color w:val="333333"/>
           <w:sz w:val="22"/>
-          <w:u w:val="single"/>
-        </w:rPr>
-        <w:t>Seafood Options</w:t>
+          <w:u w:val="none"/>
+        </w:rPr>
+        <w:t>Served alongside a selection of artisanal bread and a delightful olive oil infused with a variety of herbs.</w:t>
+      </w:r>
+    </w:p>
+    <w:p>
+      <w:pPr>
+        <w:spacing w:after="120" w:before="600"/>
+      </w:pPr>
+      <w:r>
+        <w:rPr>
+          <w:rFonts w:ascii="Open Sans" w:hAnsi="Open Sans" w:cs="Open Sans"/>
+          <w:b w:val="0"/>
+          <w:i w:val="0"/>
+          <w:color w:val="333333"/>
+          <w:sz w:val="22"/>
+          <w:u w:val="none"/>
+        </w:rPr>
       </w:r>
     </w:p>
     <w:p>
@@ -1366,55 +1466,77 @@
       </w:pPr>
       <w:r>
         <w:rPr>
-          <w:rFonts w:ascii="Open Sans" w:hAnsi="Open Sans"/>
+          <w:rFonts w:ascii="Open Sans" w:hAnsi="Open Sans" w:cs="Open Sans"/>
+          <w:b/>
+          <w:i w:val="0"/>
+          <w:color w:val="612D4B"/>
+          <w:sz w:val="27"/>
+          <w:u w:val="none"/>
+        </w:rPr>
+        <w:t>PROPOSAL OF SERVICES</w:t>
+      </w:r>
+    </w:p>
+    <w:p>
+      <w:pPr>
+        <w:spacing w:after="120" w:before="0"/>
+      </w:pPr>
+      <w:r>
+        <w:rPr>
+          <w:rFonts w:ascii="Open Sans" w:hAnsi="Open Sans" w:cs="Open Sans"/>
+          <w:b w:val="0"/>
+          <w:i w:val="0"/>
+          <w:color w:val="333333"/>
+          <w:sz w:val="22"/>
+          <w:u w:val="none"/>
+        </w:rPr>
+        <w:t>Wednesday, April 29th 2026</w:t>
+      </w:r>
+    </w:p>
+    <w:p>
+      <w:pPr>
+        <w:spacing w:after="120" w:before="0"/>
+      </w:pPr>
+      <w:r>
+        <w:rPr>
+          <w:rFonts w:ascii="Open Sans" w:hAnsi="Open Sans" w:cs="Open Sans"/>
+          <w:b w:val="0"/>
+          <w:i w:val="0"/>
+          <w:color w:val="333333"/>
+          <w:sz w:val="22"/>
+          <w:u w:val="none"/>
+        </w:rPr>
+      </w:r>
+    </w:p>
+    <w:p>
+      <w:pPr>
+        <w:spacing w:after="120" w:before="0"/>
+      </w:pPr>
+      <w:r>
+        <w:rPr>
+          <w:rFonts w:ascii="Open Sans" w:hAnsi="Open Sans" w:cs="Open Sans"/>
+          <w:b/>
+          <w:i w:val="0"/>
+          <w:color w:val="612D4B"/>
+          <w:sz w:val="24"/>
+          <w:u w:val="none"/>
+        </w:rPr>
+        <w:t>Food Service</w:t>
+      </w:r>
+    </w:p>
+    <w:p>
+      <w:pPr>
+        <w:spacing w:after="120" w:before="0"/>
+      </w:pPr>
+      <w:r>
+        <w:rPr>
+          <w:rFonts w:ascii="Open Sans" w:hAnsi="Open Sans" w:cs="Open Sans"/>
           <w:b w:val="0"/>
           <w:i/>
           <w:color w:val="333333"/>
           <w:sz w:val="20"/>
-        </w:rPr>
-        <w:t>Premium local catch</w:t>
-      </w:r>
-    </w:p>
-    <w:p>
-      <w:pPr>
-        <w:spacing w:after="40" w:before="0"/>
-        <w:ind w:left="567" w:hanging="283"/>
-      </w:pPr>
-      <w:r>
-        <w:rPr>
-          <w:b/>
-        </w:rPr>
-        <w:t xml:space="preserve">• </w:t>
-      </w:r>
-      <w:r>
-        <w:rPr>
-          <w:b/>
-          <w:u w:val="single"/>
-        </w:rPr>
-        <w:t>Cannoli lobster salad</w:t>
-      </w:r>
-      <w:r>
-        <w:rPr>
-          <w:color w:val="612D4B"/>
-          <w:sz w:val="20"/>
-        </w:rPr>
-        <w:t xml:space="preserve"> (GF)</w:t>
-      </w:r>
-    </w:p>
-    <w:p>
-      <w:pPr>
-        <w:spacing w:after="80" w:before="0"/>
-        <w:ind w:left="567"/>
-      </w:pPr>
-      <w:r>
-        <w:rPr>
-          <w:rFonts w:ascii="Open Sans" w:hAnsi="Open Sans"/>
-          <w:b w:val="0"/>
-          <w:i/>
-          <w:color w:val="555555"/>
-          <w:sz w:val="20"/>
-        </w:rPr>
-        <w:t>with spicy red pepper-mayo</w:t>
+          <w:u w:val="none"/>
+        </w:rPr>
+        <w:t>Based on 42 Guests</w:t>
       </w:r>
     </w:p>
     <w:p>
@@ -1423,207 +1545,100 @@
       </w:pPr>
       <w:r>
         <w:rPr>
-          <w:rFonts w:ascii="Open Sans" w:hAnsi="Open Sans"/>
+          <w:rFonts w:ascii="Open Sans" w:hAnsi="Open Sans" w:cs="Open Sans"/>
           <w:b/>
           <w:i w:val="0"/>
           <w:color w:val="333333"/>
           <w:sz w:val="22"/>
-          <w:u w:val="single"/>
-        </w:rPr>
-        <w:t>Vegan / Vegetarian Options.</w:t>
+          <w:u w:val="none"/>
+        </w:rPr>
+        <w:t>Wednesday, April 29th, 2026</w:t>
       </w:r>
     </w:p>
     <w:p>
       <w:pPr>
         <w:spacing w:after="40" w:before="0"/>
-        <w:ind w:left="567" w:hanging="283"/>
-      </w:pPr>
-      <w:r>
-        <w:rPr>
-          <w:b/>
-        </w:rPr>
-        <w:t xml:space="preserve">• </w:t>
-      </w:r>
-      <w:r>
-        <w:rPr>
-          <w:b/>
-          <w:u w:val="single"/>
-        </w:rPr>
-        <w:t>Artichokes &amp; sundried tomatoes mousse</w:t>
-      </w:r>
-      <w:r>
-        <w:rPr>
-          <w:color w:val="612D4B"/>
-          <w:sz w:val="20"/>
-        </w:rPr>
-        <w:t xml:space="preserve"> (VG)</w:t>
-      </w:r>
-    </w:p>
-    <w:p>
-      <w:pPr>
-        <w:spacing w:after="80" w:before="0"/>
-        <w:ind w:left="567"/>
-      </w:pPr>
-      <w:r>
-        <w:rPr>
-          <w:rFonts w:ascii="Open Sans" w:hAnsi="Open Sans"/>
-          <w:b w:val="0"/>
-          <w:i/>
-          <w:color w:val="555555"/>
-          <w:sz w:val="20"/>
-        </w:rPr>
-        <w:t>in phyllo cups and basil caviar.</w:t>
-      </w:r>
-    </w:p>
-    <w:p>
-      <w:pPr>
-        <w:spacing w:after="40" w:before="240"/>
-        <w:pBdr>
-          <w:bottom w:val="single" w:sz="6" w:space="1" w:color="000000"/>
-        </w:pBdr>
-      </w:pPr>
-    </w:p>
-    <w:p>
-      <w:pPr>
-        <w:spacing w:after="120" w:before="160"/>
-      </w:pPr>
-      <w:r>
-        <w:rPr>
-          <w:rFonts w:ascii="Open Sans" w:hAnsi="Open Sans"/>
-          <w:b/>
-          <w:i w:val="0"/>
-          <w:color w:val="612D4B"/>
-          <w:sz w:val="28"/>
-        </w:rPr>
-        <w:t>PLATED DINNER: 7:45 PM to 9:30 PM</w:t>
-      </w:r>
-    </w:p>
-    <w:p>
-      <w:pPr>
-        <w:spacing w:after="120" w:before="0"/>
-      </w:pPr>
-      <w:r>
-        <w:rPr>
-          <w:rFonts w:ascii="Open Sans" w:hAnsi="Open Sans"/>
-          <w:b w:val="0"/>
-          <w:i/>
-          <w:color w:val="333333"/>
-          <w:sz w:val="22"/>
-        </w:rPr>
-        <w:t>Served alongside a selection of artisanal bread and a delightful olive oil infused with a variety of herbs.</w:t>
-      </w:r>
-    </w:p>
-    <w:p>
-      <w:pPr>
-        <w:spacing w:after="120" w:before="120"/>
-      </w:pPr>
-      <w:r>
-        <w:rPr>
-          <w:rFonts w:ascii="Open Sans" w:hAnsi="Open Sans"/>
-          <w:b/>
-          <w:i w:val="0"/>
-          <w:color w:val="333333"/>
-          <w:sz w:val="22"/>
-          <w:u w:val="single"/>
-        </w:rPr>
-        <w:t>Appetizer - First Course</w:t>
-      </w:r>
-    </w:p>
-    <w:p>
-      <w:pPr>
-        <w:spacing w:after="40" w:before="0"/>
-        <w:ind w:left="567" w:hanging="283"/>
-      </w:pPr>
-      <w:r>
-        <w:rPr>
-          <w:b/>
-        </w:rPr>
-        <w:t xml:space="preserve">• </w:t>
-      </w:r>
-      <w:r>
-        <w:rPr>
-          <w:b/>
-          <w:u w:val="single"/>
-        </w:rPr>
-        <w:t>Roasted Baby Romaine lettuce</w:t>
-      </w:r>
-      <w:r>
-        <w:rPr>
-          <w:color w:val="612D4B"/>
-          <w:sz w:val="20"/>
-        </w:rPr>
-        <w:t xml:space="preserve"> (GF)</w:t>
-      </w:r>
-    </w:p>
-    <w:p>
-      <w:pPr>
-        <w:spacing w:after="80" w:before="0"/>
-        <w:ind w:left="567"/>
-      </w:pPr>
-      <w:r>
-        <w:rPr>
-          <w:rFonts w:ascii="Open Sans" w:hAnsi="Open Sans"/>
-          <w:b w:val="0"/>
-          <w:i/>
-          <w:color w:val="555555"/>
-          <w:sz w:val="20"/>
-        </w:rPr>
-        <w:t>fresh shaved fennel, marinated with honey mustard, fried capers &amp; crumbled Gorgonzola cheese</w:t>
-      </w:r>
-    </w:p>
-    <w:p>
-      <w:pPr>
-        <w:spacing w:after="120" w:before="600"/>
-      </w:pPr>
-    </w:p>
-    <w:p>
-      <w:pPr>
-        <w:spacing w:after="120" w:before="0"/>
-      </w:pPr>
-      <w:r>
-        <w:rPr>
-          <w:rFonts w:ascii="Open Sans" w:hAnsi="Open Sans"/>
-          <w:b/>
-          <w:i w:val="0"/>
-          <w:color w:val="612D4B"/>
-          <w:sz w:val="28"/>
-        </w:rPr>
-        <w:t>PROPOSAL OF SERVICES</w:t>
-      </w:r>
-    </w:p>
-    <w:p>
-      <w:pPr>
-        <w:spacing w:after="120" w:before="0"/>
-      </w:pPr>
-      <w:r>
-        <w:rPr>
-          <w:rFonts w:ascii="Open Sans" w:hAnsi="Open Sans"/>
+      </w:pPr>
+      <w:r>
+        <w:rPr>
+          <w:rFonts w:ascii="Open Sans" w:hAnsi="Open Sans" w:cs="Open Sans"/>
           <w:b w:val="0"/>
           <w:i w:val="0"/>
           <w:color w:val="333333"/>
           <w:sz w:val="22"/>
-        </w:rPr>
-        <w:t>Wednesday, April 29th 2026</w:t>
-      </w:r>
-    </w:p>
-    <w:p>
-      <w:pPr>
-        <w:spacing w:after="120" w:before="0"/>
-      </w:pPr>
-    </w:p>
-    <w:p>
-      <w:pPr>
-        <w:spacing w:after="120" w:before="0"/>
-      </w:pPr>
-      <w:r>
-        <w:rPr>
-          <w:rFonts w:ascii="Open Sans" w:hAnsi="Open Sans"/>
+          <w:u w:val="none"/>
+        </w:rPr>
+      </w:r>
+      <w:r>
+        <w:t>Seafood Options</w:t>
+      </w:r>
+      <w:r>
+        <w:tab/>
+      </w:r>
+      <w:r>
+        <w:rPr>
+          <w:b/>
+        </w:rPr>
+        <w:t>$420.00</w:t>
+      </w:r>
+    </w:p>
+    <w:p>
+      <w:pPr>
+        <w:spacing w:after="40" w:before="0"/>
+      </w:pPr>
+      <w:r>
+        <w:rPr>
+          <w:rFonts w:ascii="Open Sans" w:hAnsi="Open Sans" w:cs="Open Sans"/>
+          <w:b w:val="0"/>
+          <w:i w:val="0"/>
+          <w:color w:val="333333"/>
+          <w:sz w:val="22"/>
+          <w:u w:val="none"/>
+        </w:rPr>
+      </w:r>
+      <w:r>
+        <w:t>Main Course Selection</w:t>
+      </w:r>
+      <w:r>
+        <w:tab/>
+      </w:r>
+      <w:r>
+        <w:rPr>
+          <w:b/>
+        </w:rPr>
+        <w:t>$1,260.00</w:t>
+      </w:r>
+    </w:p>
+    <w:p>
+      <w:pPr>
+        <w:spacing w:after="120" w:before="300"/>
+      </w:pPr>
+      <w:r>
+        <w:rPr>
+          <w:rFonts w:ascii="Open Sans" w:hAnsi="Open Sans" w:cs="Open Sans"/>
           <w:b/>
           <w:i w:val="0"/>
           <w:color w:val="612D4B"/>
           <w:sz w:val="24"/>
-        </w:rPr>
-        <w:t>Food Service</w:t>
+          <w:u w:val="none"/>
+        </w:rPr>
+        <w:t>Labor Service Fees</w:t>
+      </w:r>
+    </w:p>
+    <w:p>
+      <w:pPr>
+        <w:spacing w:after="120" w:before="120"/>
+      </w:pPr>
+      <w:r>
+        <w:rPr>
+          <w:rFonts w:ascii="Open Sans" w:hAnsi="Open Sans" w:cs="Open Sans"/>
+          <w:b/>
+          <w:i w:val="0"/>
+          <w:color w:val="333333"/>
+          <w:sz w:val="22"/>
+          <w:u w:val="none"/>
+        </w:rPr>
+        <w:t>Wednesday, April 29th</w:t>
       </w:r>
     </w:p>
     <w:p>
@@ -1632,62 +1647,37 @@
       </w:pPr>
       <w:r>
         <w:rPr>
-          <w:rFonts w:ascii="Open Sans" w:hAnsi="Open Sans"/>
+          <w:rFonts w:ascii="Open Sans" w:hAnsi="Open Sans" w:cs="Open Sans"/>
           <w:b w:val="0"/>
           <w:i/>
           <w:color w:val="333333"/>
           <w:sz w:val="20"/>
-        </w:rPr>
-        <w:t>Based on 42 Guests</w:t>
-      </w:r>
-    </w:p>
-    <w:p>
-      <w:pPr>
-        <w:spacing w:after="120" w:before="120"/>
-      </w:pPr>
-      <w:r>
-        <w:rPr>
-          <w:rFonts w:ascii="Open Sans" w:hAnsi="Open Sans"/>
-          <w:b/>
+          <w:u w:val="none"/>
+        </w:rPr>
+        <w:t>Staff suggested based on 5 hours of labor</w:t>
+      </w:r>
+    </w:p>
+    <w:p>
+      <w:pPr>
+        <w:spacing w:after="80" w:before="0"/>
+      </w:pPr>
+      <w:r>
+        <w:rPr>
+          <w:rFonts w:ascii="Open Sans" w:hAnsi="Open Sans" w:cs="Open Sans"/>
+          <w:b w:val="0"/>
           <w:i w:val="0"/>
           <w:color w:val="333333"/>
           <w:sz w:val="22"/>
-        </w:rPr>
-        <w:t>Wednesday, April 29th, 2026</w:t>
-      </w:r>
-    </w:p>
-    <w:p>
-      <w:pPr>
-        <w:spacing w:after="40" w:before="0"/>
-      </w:pPr>
-      <w:r>
-        <w:t>Seafood Options</w:t>
-      </w:r>
-      <w:r>
+          <w:u w:val="none"/>
+        </w:rPr>
+      </w:r>
+      <w:r>
+        <w:rPr>
+          <w:b/>
+        </w:rPr>
+        <w:t>Wait Staff (4)</w:t>
         <w:tab/>
-      </w:r>
-      <w:r>
-        <w:rPr>
-          <w:b/>
-        </w:rPr>
-        <w:t>$420.00</w:t>
-      </w:r>
-    </w:p>
-    <w:p>
-      <w:pPr>
-        <w:spacing w:after="40" w:before="0"/>
-      </w:pPr>
-      <w:r>
-        <w:t>Main Course Selection</w:t>
-      </w:r>
-      <w:r>
-        <w:tab/>
-      </w:r>
-      <w:r>
-        <w:rPr>
-          <w:b/>
-        </w:rPr>
-        <w:t>$1,260.00</w:t>
+        <w:t>$800.00</w:t>
       </w:r>
     </w:p>
     <w:p>
@@ -1696,92 +1686,46 @@
       </w:pPr>
       <w:r>
         <w:rPr>
-          <w:rFonts w:ascii="Open Sans" w:hAnsi="Open Sans"/>
+          <w:rFonts w:ascii="Open Sans" w:hAnsi="Open Sans" w:cs="Open Sans"/>
           <w:b/>
           <w:i w:val="0"/>
           <w:color w:val="612D4B"/>
           <w:sz w:val="24"/>
-        </w:rPr>
-        <w:t>Labor Service Fees</w:t>
-      </w:r>
-    </w:p>
-    <w:p>
-      <w:pPr>
-        <w:spacing w:after="120" w:before="120"/>
-      </w:pPr>
-      <w:r>
-        <w:rPr>
-          <w:rFonts w:ascii="Open Sans" w:hAnsi="Open Sans"/>
+          <w:u w:val="none"/>
+        </w:rPr>
+        <w:t>Extras Services</w:t>
+      </w:r>
+    </w:p>
+    <w:p>
+      <w:pPr>
+        <w:spacing w:after="120" w:before="0"/>
+      </w:pPr>
+      <w:r>
+        <w:rPr>
+          <w:rFonts w:ascii="Open Sans" w:hAnsi="Open Sans" w:cs="Open Sans"/>
           <w:b/>
           <w:i w:val="0"/>
           <w:color w:val="333333"/>
           <w:sz w:val="22"/>
+          <w:u w:val="none"/>
         </w:rPr>
         <w:t>Wednesday, April 29th</w:t>
       </w:r>
     </w:p>
     <w:p>
       <w:pPr>
-        <w:spacing w:after="120" w:before="0"/>
-      </w:pPr>
-      <w:r>
-        <w:rPr>
-          <w:rFonts w:ascii="Open Sans" w:hAnsi="Open Sans"/>
+        <w:spacing w:after="40" w:before="0"/>
+      </w:pPr>
+      <w:r>
+        <w:rPr>
+          <w:rFonts w:ascii="Open Sans" w:hAnsi="Open Sans" w:cs="Open Sans"/>
           <w:b w:val="0"/>
-          <w:i/>
-          <w:color w:val="333333"/>
-          <w:sz w:val="20"/>
-        </w:rPr>
-        <w:t>Staff suggested based on 5 hours of labor</w:t>
-      </w:r>
-    </w:p>
-    <w:p>
-      <w:pPr>
-        <w:spacing w:after="80" w:before="0"/>
-      </w:pPr>
-      <w:r>
-        <w:rPr>
-          <w:b/>
-        </w:rPr>
-        <w:t>Wait Staff (4)</w:t>
-        <w:tab/>
-        <w:t>$800.00</w:t>
-      </w:r>
-    </w:p>
-    <w:p>
-      <w:pPr>
-        <w:spacing w:after="120" w:before="300"/>
-      </w:pPr>
-      <w:r>
-        <w:rPr>
-          <w:rFonts w:ascii="Open Sans" w:hAnsi="Open Sans"/>
-          <w:b/>
-          <w:i w:val="0"/>
-          <w:color w:val="612D4B"/>
-          <w:sz w:val="24"/>
-        </w:rPr>
-        <w:t>Extras Services</w:t>
-      </w:r>
-    </w:p>
-    <w:p>
-      <w:pPr>
-        <w:spacing w:after="120" w:before="0"/>
-      </w:pPr>
-      <w:r>
-        <w:rPr>
-          <w:rFonts w:ascii="Open Sans" w:hAnsi="Open Sans"/>
-          <w:b/>
           <w:i w:val="0"/>
           <w:color w:val="333333"/>
           <w:sz w:val="22"/>
-        </w:rPr>
-        <w:t>Wednesday, April 29th</w:t>
-      </w:r>
-    </w:p>
-    <w:p>
-      <w:pPr>
-        <w:spacing w:after="40" w:before="0"/>
-      </w:pPr>
+          <w:u w:val="none"/>
+        </w:rPr>
+      </w:r>
       <w:r>
         <w:rPr>
           <w:b/>
@@ -1795,11 +1739,31 @@
       <w:pPr>
         <w:spacing w:after="120" w:before="400"/>
       </w:pPr>
+      <w:r>
+        <w:rPr>
+          <w:rFonts w:ascii="Open Sans" w:hAnsi="Open Sans" w:cs="Open Sans"/>
+          <w:b w:val="0"/>
+          <w:i w:val="0"/>
+          <w:color w:val="333333"/>
+          <w:sz w:val="22"/>
+          <w:u w:val="none"/>
+        </w:rPr>
+      </w:r>
     </w:p>
     <w:p>
       <w:pPr>
         <w:spacing w:after="40" w:before="0"/>
       </w:pPr>
+      <w:r>
+        <w:rPr>
+          <w:rFonts w:ascii="Open Sans" w:hAnsi="Open Sans" w:cs="Open Sans"/>
+          <w:b w:val="0"/>
+          <w:i w:val="0"/>
+          <w:color w:val="333333"/>
+          <w:sz w:val="22"/>
+          <w:u w:val="none"/>
+        </w:rPr>
+      </w:r>
       <w:r>
         <w:t>Food</w:t>
         <w:tab/>
@@ -1811,6 +1775,16 @@
         <w:spacing w:after="40" w:before="0"/>
       </w:pPr>
       <w:r>
+        <w:rPr>
+          <w:rFonts w:ascii="Open Sans" w:hAnsi="Open Sans" w:cs="Open Sans"/>
+          <w:b w:val="0"/>
+          <w:i w:val="0"/>
+          <w:color w:val="333333"/>
+          <w:sz w:val="22"/>
+          <w:u w:val="none"/>
+        </w:rPr>
+      </w:r>
+      <w:r>
         <w:t>Labor Cost</w:t>
         <w:tab/>
         <w:t>$800.00</w:t>
@@ -1821,6 +1795,16 @@
         <w:spacing w:after="40" w:before="0"/>
       </w:pPr>
       <w:r>
+        <w:rPr>
+          <w:rFonts w:ascii="Open Sans" w:hAnsi="Open Sans" w:cs="Open Sans"/>
+          <w:b w:val="0"/>
+          <w:i w:val="0"/>
+          <w:color w:val="333333"/>
+          <w:sz w:val="22"/>
+          <w:u w:val="none"/>
+        </w:rPr>
+      </w:r>
+      <w:r>
         <w:t>Extras Services</w:t>
         <w:tab/>
         <w:t>$350.00</w:t>
@@ -1831,6 +1815,16 @@
         <w:spacing w:after="40" w:before="0"/>
       </w:pPr>
       <w:r>
+        <w:rPr>
+          <w:rFonts w:ascii="Open Sans" w:hAnsi="Open Sans" w:cs="Open Sans"/>
+          <w:b w:val="0"/>
+          <w:i w:val="0"/>
+          <w:color w:val="333333"/>
+          <w:sz w:val="22"/>
+          <w:u w:val="none"/>
+        </w:rPr>
+      </w:r>
+      <w:r>
         <w:t>6.625% NJ Sales Tax</w:t>
         <w:tab/>
         <w:t>$12.00</w:t>
@@ -1841,6 +1835,16 @@
         <w:spacing w:after="40" w:before="0"/>
       </w:pPr>
       <w:r>
+        <w:rPr>
+          <w:rFonts w:ascii="Open Sans" w:hAnsi="Open Sans" w:cs="Open Sans"/>
+          <w:b w:val="0"/>
+          <w:i w:val="0"/>
+          <w:color w:val="333333"/>
+          <w:sz w:val="22"/>
+          <w:u w:val="none"/>
+        </w:rPr>
+      </w:r>
+      <w:r>
         <w:t>22% Service Charge</w:t>
         <w:tab/>
         <w:t>$550.00</w:t>
@@ -1848,18 +1852,19 @@
     </w:p>
     <w:p>
       <w:pPr>
-        <w:spacing w:after="120" w:before="160"/>
         <w:pBdr>
           <w:top w:val="single" w:sz="12" w:color="612D4B"/>
         </w:pBdr>
-      </w:pPr>
-      <w:r>
-        <w:rPr>
-          <w:rFonts w:ascii="Open Sans" w:hAnsi="Open Sans"/>
+        <w:spacing w:after="120" w:before="160"/>
+      </w:pPr>
+      <w:r>
+        <w:rPr>
+          <w:rFonts w:ascii="Open Sans" w:hAnsi="Open Sans" w:cs="Open Sans"/>
           <w:b/>
           <w:i w:val="0"/>
           <w:color w:val="612D4B"/>
           <w:sz w:val="26"/>
+          <w:u w:val="none"/>
         </w:rPr>
         <w:t>Total Estimate</w:t>
         <w:tab/>
@@ -2123,6 +2128,14 @@
       <w:tblPr>
         <w:tblStyle w:val="Tablaconcuadrcula"/>
         <w:tblW w:w="0" w:type="auto"/>
+        <w:tblBorders>
+          <w:top w:val="none" w:sz="0" w:space="0" w:color="auto"/>
+          <w:left w:val="none" w:sz="0" w:space="0" w:color="auto"/>
+          <w:bottom w:val="none" w:sz="0" w:space="0" w:color="auto"/>
+          <w:right w:val="none" w:sz="0" w:space="0" w:color="auto"/>
+          <w:insideH w:val="none" w:sz="0" w:space="0" w:color="auto"/>
+          <w:insideV w:val="none" w:sz="0" w:space="0" w:color="auto"/>
+        </w:tblBorders>
         <w:tblLook w:val="04A0" w:firstRow="1" w:lastRow="0" w:firstColumn="1" w:lastColumn="0" w:noHBand="0" w:noVBand="1"/>
       </w:tblPr>
       <w:tblGrid>
@@ -2218,7 +2231,7 @@
             </w:pPr>
             <w:r>
               <w:rPr>
-                <w:rFonts w:ascii="Cambria" w:hAnsi="Cambria"/>
+                <w:rFonts w:ascii="Open Sans" w:hAnsi="Open Sans" w:cs="Open Sans"/>
                 <w:color w:val="000000"/>
                 <w:sz w:val="18"/>
                 <w:lang w:val="en-US"/>
@@ -2235,6 +2248,7 @@
             </w:pPr>
             <w:r>
               <w:rPr>
+                <w:rFonts w:ascii="Open Sans" w:hAnsi="Open Sans" w:cs="Open Sans"/>
                 <w:sz w:val="20"/>
                 <w:lang w:val="en-US"/>
               </w:rPr>
@@ -2250,6 +2264,7 @@
             </w:pPr>
             <w:r>
               <w:rPr>
+                <w:rFonts w:ascii="Open Sans" w:hAnsi="Open Sans" w:cs="Open Sans"/>
                 <w:sz w:val="20"/>
                 <w:lang w:val="en-US"/>
               </w:rPr>
@@ -2287,6 +2302,7 @@
             </w:pPr>
             <w:r>
               <w:rPr>
+                <w:rFonts w:ascii="Open Sans" w:hAnsi="Open Sans" w:cs="Open Sans"/>
                 <w:sz w:val="20"/>
                 <w:lang w:val="en-US"/>
               </w:rPr>
@@ -2302,6 +2318,7 @@
             </w:pPr>
             <w:r>
               <w:rPr>
+                <w:rFonts w:ascii="Open Sans" w:hAnsi="Open Sans" w:cs="Open Sans"/>
                 <w:sz w:val="20"/>
                 <w:lang w:val="en-US"/>
               </w:rPr>
@@ -2317,6 +2334,7 @@
             </w:pPr>
             <w:r>
               <w:rPr>
+                <w:rFonts w:ascii="Open Sans" w:hAnsi="Open Sans" w:cs="Open Sans"/>
                 <w:sz w:val="20"/>
                 <w:lang w:val="en-US"/>
               </w:rPr>
@@ -2354,6 +2372,7 @@
             </w:pPr>
             <w:r>
               <w:rPr>
+                <w:rFonts w:ascii="Open Sans" w:hAnsi="Open Sans" w:cs="Open Sans"/>
                 <w:sz w:val="20"/>
                 <w:lang w:val="en-US"/>
               </w:rPr>
@@ -2369,6 +2388,7 @@
             </w:pPr>
             <w:r>
               <w:rPr>
+                <w:rFonts w:ascii="Open Sans" w:hAnsi="Open Sans" w:cs="Open Sans"/>
                 <w:sz w:val="20"/>
                 <w:lang w:val="en-US"/>
               </w:rPr>
@@ -2384,6 +2404,7 @@
             </w:pPr>
             <w:r>
               <w:rPr>
+                <w:rFonts w:ascii="Open Sans" w:hAnsi="Open Sans" w:cs="Open Sans"/>
                 <w:sz w:val="20"/>
                 <w:lang w:val="en-US"/>
               </w:rPr>
@@ -2399,6 +2420,7 @@
             </w:pPr>
             <w:r>
               <w:rPr>
+                <w:rFonts w:ascii="Open Sans" w:hAnsi="Open Sans" w:cs="Open Sans"/>
                 <w:sz w:val="20"/>
                 <w:lang w:val="en-US"/>
               </w:rPr>
@@ -2406,6 +2428,7 @@
             </w:r>
             <w:r>
               <w:rPr>
+                <w:rFonts w:ascii="Open Sans" w:hAnsi="Open Sans" w:cs="Open Sans"/>
                 <w:sz w:val="20"/>
                 <w:lang w:val="en-US"/>
               </w:rPr>
@@ -2564,7 +2587,47 @@
                 <w:szCs w:val="18"/>
                 <w:lang w:val="en-US"/>
               </w:rPr>
-              <w:t>If a client resquets that the caterer coordinate the venue rental &amp; décor, entertainment, photography, valet parking, flower arranging, or other aspects of planning the event, there will be a small fee charged for this service to account for the labor needed to plan the event as agreed upon in writing by the parties at the time of such request.</w:t>
+              <w:t xml:space="preserve">If a client </w:t>
+            </w:r>
+            <w:proofErr w:type="spellStart"/>
+            <w:r>
+              <w:rPr>
+                <w:rFonts w:ascii="Open Sans Medium" w:hAnsi="Open Sans Medium" w:cs="Open Sans Medium"/>
+                <w:sz w:val="18"/>
+                <w:szCs w:val="18"/>
+                <w:lang w:val="en-US"/>
+              </w:rPr>
+              <w:t>resquets</w:t>
+            </w:r>
+            <w:proofErr w:type="spellEnd"/>
+            <w:r>
+              <w:rPr>
+                <w:rFonts w:ascii="Open Sans Medium" w:hAnsi="Open Sans Medium" w:cs="Open Sans Medium"/>
+                <w:sz w:val="18"/>
+                <w:szCs w:val="18"/>
+                <w:lang w:val="en-US"/>
+              </w:rPr>
+              <w:t xml:space="preserve"> that the caterer </w:t>
+            </w:r>
+            <w:proofErr w:type="gramStart"/>
+            <w:r>
+              <w:rPr>
+                <w:rFonts w:ascii="Open Sans Medium" w:hAnsi="Open Sans Medium" w:cs="Open Sans Medium"/>
+                <w:sz w:val="18"/>
+                <w:szCs w:val="18"/>
+                <w:lang w:val="en-US"/>
+              </w:rPr>
+              <w:t>coordinate</w:t>
+            </w:r>
+            <w:proofErr w:type="gramEnd"/>
+            <w:r>
+              <w:rPr>
+                <w:rFonts w:ascii="Open Sans Medium" w:hAnsi="Open Sans Medium" w:cs="Open Sans Medium"/>
+                <w:sz w:val="18"/>
+                <w:szCs w:val="18"/>
+                <w:lang w:val="en-US"/>
+              </w:rPr>
+              <w:t xml:space="preserve"> the venue rental &amp; décor, entertainment, photography, valet parking, flower arranging, or other aspects of planning the event, there will be a small fee charged for this service to account for the labor needed to plan the event as agreed upon in writing by the parties at the time of such request.</w:t>
             </w:r>
           </w:p>
           <w:p>
@@ -2770,6 +2833,7 @@
                 <w:lang w:val="en-US"/>
               </w:rPr>
             </w:pPr>
+            <w:proofErr w:type="spellStart"/>
             <w:r>
               <w:rPr>
                 <w:rFonts w:ascii="Open Sans Medium" w:hAnsi="Open Sans Medium" w:cs="Open Sans Medium"/>
@@ -2777,7 +2841,17 @@
                 <w:szCs w:val="18"/>
                 <w:lang w:val="en-US"/>
               </w:rPr>
-              <w:t>Foodesign Conceptual Events and the Client acknowledge and agree that this proposal is governed by the Master Caterer Agreement executed between the parties.</w:t>
+              <w:t>Foodesign</w:t>
+            </w:r>
+            <w:proofErr w:type="spellEnd"/>
+            <w:r>
+              <w:rPr>
+                <w:rFonts w:ascii="Open Sans Medium" w:hAnsi="Open Sans Medium" w:cs="Open Sans Medium"/>
+                <w:sz w:val="18"/>
+                <w:szCs w:val="18"/>
+                <w:lang w:val="en-US"/>
+              </w:rPr>
+              <w:t xml:space="preserve"> Conceptual Events and the Client acknowledge and agree that this proposal is governed by the Master Caterer Agreement executed between the parties.</w:t>
             </w:r>
           </w:p>
           <w:p>
@@ -2820,7 +2894,27 @@
                 <w:szCs w:val="18"/>
                 <w:lang w:val="en-US"/>
               </w:rPr>
-              <w:t>The undersigned, as a duly authorized representative of the Client, Math for America, hereby contract the services of Foodesign Conceptual Events as listed and quoted in this proposal on behalf of the Client according to the terms and conditions herein.</w:t>
+              <w:t xml:space="preserve">The undersigned, as a duly authorized representative of the Client, Math for America, hereby contract the services of </w:t>
+            </w:r>
+            <w:proofErr w:type="spellStart"/>
+            <w:r>
+              <w:rPr>
+                <w:rFonts w:ascii="Open Sans Medium" w:hAnsi="Open Sans Medium" w:cs="Open Sans Medium"/>
+                <w:sz w:val="18"/>
+                <w:szCs w:val="18"/>
+                <w:lang w:val="en-US"/>
+              </w:rPr>
+              <w:t>Foodesign</w:t>
+            </w:r>
+            <w:proofErr w:type="spellEnd"/>
+            <w:r>
+              <w:rPr>
+                <w:rFonts w:ascii="Open Sans Medium" w:hAnsi="Open Sans Medium" w:cs="Open Sans Medium"/>
+                <w:sz w:val="18"/>
+                <w:szCs w:val="18"/>
+                <w:lang w:val="en-US"/>
+              </w:rPr>
+              <w:t xml:space="preserve"> Conceptual Events as listed and quoted in this proposal on behalf of the Client according to the terms and conditions herein.</w:t>
             </w:r>
           </w:p>
           <w:p>
@@ -3490,11 +3584,20 @@
         </w:pPr>
         <w:r>
           <w:rPr>
+            <w:rFonts w:ascii="Open Sans" w:hAnsi="Open Sans"/>
             <w:sz w:val="18"/>
             <w:szCs w:val="18"/>
             <w:lang w:val="en-US"/>
           </w:rPr>
-          <w:t xml:space="preserve">Simons Society of Fellows Dinner </w:t>
+          <w:t>Simons Foundation</w:t>
+        </w:r>
+        <w:r>
+          <w:rPr>
+            <w:sz w:val="18"/>
+            <w:szCs w:val="18"/>
+            <w:lang w:val="en-US"/>
+          </w:rPr>
+          <w:t xml:space="preserve"> </w:t>
         </w:r>
       </w:p>
     </w:sdtContent>

</xml_diff>

<commit_message>
refactor: implement chronological sorting for meals, labor, and extras with robust date parsing and deduplicated headers
</commit_message>
<xml_diff>
--- a/REFACTOR_TEST_RESULT.docx
+++ b/REFACTOR_TEST_RESULT.docx
@@ -1308,118 +1308,7 @@
     </w:p>
     <w:p>
       <w:pPr>
-        <w:spacing w:after="120" w:before="160"/>
-      </w:pPr>
-      <w:r>
-        <w:rPr>
-          <w:rFonts w:ascii="Open Sans" w:hAnsi="Open Sans" w:cs="Open Sans"/>
-          <w:b/>
-          <w:i w:val="0"/>
-          <w:color w:val="612D4B"/>
-          <w:sz w:val="20"/>
-          <w:u w:val="none"/>
-        </w:rPr>
-        <w:t>PLATED DINNER: 7:45 PM to 9:30 PM</w:t>
-      </w:r>
-    </w:p>
-    <w:p>
-      <w:pPr>
-        <w:spacing w:after="120" w:before="0"/>
-      </w:pPr>
-      <w:r>
-        <w:rPr>
-          <w:rFonts w:ascii="Open Sans" w:hAnsi="Open Sans" w:cs="Open Sans"/>
-          <w:b w:val="0"/>
-          <w:i/>
-          <w:color w:val="333333"/>
-          <w:sz w:val="20"/>
-          <w:u w:val="none"/>
-        </w:rPr>
-        <w:t>Served alongside a selection of artisanal bread and a delightful olive oil infused with a variety of herbs.</w:t>
-      </w:r>
-    </w:p>
-    <w:p>
-      <w:pPr>
-        <w:spacing w:after="120" w:before="200"/>
-      </w:pPr>
-      <w:r>
-        <w:rPr>
-          <w:rFonts w:ascii="Open Sans" w:hAnsi="Open Sans" w:cs="Open Sans"/>
-          <w:b w:val="0"/>
-          <w:i w:val="0"/>
-          <w:color w:val="333333"/>
-          <w:sz w:val="20"/>
-          <w:u w:val="none"/>
-        </w:rPr>
-      </w:r>
-    </w:p>
-    <w:p>
-      <w:pPr>
-        <w:spacing w:after="0" w:before="200"/>
-      </w:pPr>
-      <w:r>
-        <w:rPr>
-          <w:rFonts w:ascii="Open Sans" w:hAnsi="Open Sans" w:cs="Open Sans"/>
-          <w:b/>
-          <w:i w:val="0"/>
-          <w:color w:val="612D4B"/>
-          <w:sz w:val="20"/>
-          <w:u w:val="none"/>
-        </w:rPr>
-        <w:t>PROPOSAL OF SERVICES</w:t>
-      </w:r>
-    </w:p>
-    <w:p>
-      <w:pPr>
-        <w:spacing w:after="0" w:before="0"/>
-      </w:pPr>
-      <w:r>
-        <w:rPr>
-          <w:rFonts w:ascii="Open Sans" w:hAnsi="Open Sans" w:cs="Open Sans"/>
-          <w:b w:val="0"/>
-          <w:i w:val="0"/>
-          <w:color w:val="333333"/>
-          <w:sz w:val="20"/>
-          <w:u w:val="none"/>
-        </w:rPr>
-        <w:t>Wednesday, April 29th 2026</w:t>
-      </w:r>
-    </w:p>
-    <w:p>
-      <w:pPr>
-        <w:spacing w:after="0" w:before="200"/>
-      </w:pPr>
-      <w:r>
-        <w:rPr>
-          <w:rFonts w:ascii="Open Sans" w:hAnsi="Open Sans" w:cs="Open Sans"/>
-          <w:b/>
-          <w:i w:val="0"/>
-          <w:color w:val="612D4B"/>
-          <w:sz w:val="20"/>
-          <w:u w:val="none"/>
-        </w:rPr>
-        <w:t>Food Service</w:t>
-      </w:r>
-    </w:p>
-    <w:p>
-      <w:pPr>
-        <w:spacing w:after="120" w:before="0"/>
-      </w:pPr>
-      <w:r>
-        <w:rPr>
-          <w:rFonts w:ascii="Open Sans" w:hAnsi="Open Sans" w:cs="Open Sans"/>
-          <w:b w:val="0"/>
-          <w:i/>
-          <w:color w:val="333333"/>
-          <w:sz w:val="20"/>
-          <w:u w:val="none"/>
-        </w:rPr>
-        <w:t>Based on 42 Guests</w:t>
-      </w:r>
-    </w:p>
-    <w:p>
-      <w:pPr>
-        <w:spacing w:after="0" w:before="120"/>
+        <w:spacing w:after="120" w:before="120"/>
       </w:pPr>
       <w:r>
         <w:rPr>
@@ -1430,7 +1319,6 @@
           <w:sz w:val="20"/>
           <w:u w:val="none"/>
         </w:rPr>
-        <w:t>Wednesday, April 29th, 2026</w:t>
       </w:r>
     </w:p>
     <w:p>
@@ -1453,6 +1341,151 @@
     </w:p>
     <w:p>
       <w:pPr>
+        <w:spacing w:after="120" w:before="160"/>
+      </w:pPr>
+      <w:r>
+        <w:rPr>
+          <w:rFonts w:ascii="Open Sans" w:hAnsi="Open Sans" w:cs="Open Sans"/>
+          <w:b/>
+          <w:i w:val="0"/>
+          <w:color w:val="612D4B"/>
+          <w:sz w:val="20"/>
+          <w:u w:val="none"/>
+        </w:rPr>
+        <w:t>PLATED DINNER: 7:45 PM to 9:30 PM</w:t>
+      </w:r>
+    </w:p>
+    <w:p>
+      <w:pPr>
+        <w:spacing w:after="120" w:before="0"/>
+      </w:pPr>
+      <w:r>
+        <w:rPr>
+          <w:rFonts w:ascii="Open Sans" w:hAnsi="Open Sans" w:cs="Open Sans"/>
+          <w:b w:val="0"/>
+          <w:i/>
+          <w:color w:val="333333"/>
+          <w:sz w:val="20"/>
+          <w:u w:val="none"/>
+        </w:rPr>
+        <w:t>Served alongside a selection of artisanal bread and a delightful olive oil infused with a variety of herbs.</w:t>
+      </w:r>
+    </w:p>
+    <w:p>
+      <w:pPr>
+        <w:spacing w:after="120" w:before="200"/>
+      </w:pPr>
+      <w:r>
+        <w:rPr>
+          <w:rFonts w:ascii="Open Sans" w:hAnsi="Open Sans" w:cs="Open Sans"/>
+          <w:b w:val="0"/>
+          <w:i w:val="0"/>
+          <w:color w:val="333333"/>
+          <w:sz w:val="20"/>
+          <w:u w:val="none"/>
+        </w:rPr>
+      </w:r>
+    </w:p>
+    <w:p>
+      <w:pPr>
+        <w:spacing w:after="0" w:before="200"/>
+      </w:pPr>
+      <w:r>
+        <w:rPr>
+          <w:rFonts w:ascii="Open Sans" w:hAnsi="Open Sans" w:cs="Open Sans"/>
+          <w:b/>
+          <w:i w:val="0"/>
+          <w:color w:val="612D4B"/>
+          <w:sz w:val="20"/>
+          <w:u w:val="none"/>
+        </w:rPr>
+        <w:t>PROPOSAL OF SERVICES</w:t>
+      </w:r>
+    </w:p>
+    <w:p>
+      <w:pPr>
+        <w:spacing w:after="0" w:before="0"/>
+      </w:pPr>
+      <w:r>
+        <w:rPr>
+          <w:rFonts w:ascii="Open Sans" w:hAnsi="Open Sans" w:cs="Open Sans"/>
+          <w:b w:val="0"/>
+          <w:i w:val="0"/>
+          <w:color w:val="333333"/>
+          <w:sz w:val="20"/>
+          <w:u w:val="none"/>
+        </w:rPr>
+        <w:t>Wednesday, April 29th 2026</w:t>
+      </w:r>
+    </w:p>
+    <w:p>
+      <w:pPr>
+        <w:spacing w:after="0" w:before="200"/>
+      </w:pPr>
+      <w:r>
+        <w:rPr>
+          <w:rFonts w:ascii="Open Sans" w:hAnsi="Open Sans" w:cs="Open Sans"/>
+          <w:b/>
+          <w:i w:val="0"/>
+          <w:color w:val="612D4B"/>
+          <w:sz w:val="20"/>
+          <w:u w:val="none"/>
+        </w:rPr>
+        <w:t>Food Service</w:t>
+      </w:r>
+    </w:p>
+    <w:p>
+      <w:pPr>
+        <w:spacing w:after="120" w:before="0"/>
+      </w:pPr>
+      <w:r>
+        <w:rPr>
+          <w:rFonts w:ascii="Open Sans" w:hAnsi="Open Sans" w:cs="Open Sans"/>
+          <w:b w:val="0"/>
+          <w:i/>
+          <w:color w:val="333333"/>
+          <w:sz w:val="20"/>
+          <w:u w:val="none"/>
+        </w:rPr>
+        <w:t>Based on 42 Guests</w:t>
+      </w:r>
+    </w:p>
+    <w:p>
+      <w:pPr>
+        <w:spacing w:after="0" w:before="120"/>
+      </w:pPr>
+      <w:r>
+        <w:rPr>
+          <w:rFonts w:ascii="Open Sans" w:hAnsi="Open Sans" w:cs="Open Sans"/>
+          <w:b/>
+          <w:i w:val="0"/>
+          <w:color w:val="333333"/>
+          <w:sz w:val="20"/>
+          <w:u w:val="none"/>
+        </w:rPr>
+        <w:t>Wednesday, April 29th, 2026</w:t>
+      </w:r>
+    </w:p>
+    <w:p>
+      <w:pPr>
+        <w:pBdr>
+          <w:bottom w:val="single" w:sz="6" w:space="1" w:color="000000"/>
+        </w:pBdr>
+        <w:spacing w:after="60" w:before="0" w:line="20" w:lineRule="exact"/>
+      </w:pPr>
+      <w:r>
+        <w:rPr>
+          <w:rFonts w:ascii="Open Sans" w:hAnsi="Open Sans" w:cs="Open Sans"/>
+          <w:b w:val="0"/>
+          <w:i w:val="0"/>
+          <w:color w:val="333333"/>
+          <w:sz w:val="2"/>
+          <w:u w:val="none"/>
+        </w:rPr>
+      </w:r>
+    </w:p>
+    <w:p>
+      <w:pPr>
         <w:spacing w:after="80" w:before="0"/>
       </w:pPr>
       <w:r>
@@ -1505,6 +1538,55 @@
           <w:sz w:val="20"/>
         </w:rPr>
         <w:t>$ 420.00</w:t>
+      </w:r>
+    </w:p>
+    <w:p>
+      <w:pPr>
+        <w:spacing w:after="0" w:before="120"/>
+      </w:pPr>
+      <w:r>
+        <w:rPr>
+          <w:rFonts w:ascii="Open Sans" w:hAnsi="Open Sans" w:cs="Open Sans"/>
+          <w:b/>
+          <w:i w:val="0"/>
+          <w:color w:val="333333"/>
+          <w:sz w:val="20"/>
+          <w:u w:val="none"/>
+        </w:rPr>
+      </w:r>
+    </w:p>
+    <w:p>
+      <w:pPr>
+        <w:pBdr>
+          <w:bottom w:val="single" w:sz="6" w:space="1" w:color="000000"/>
+        </w:pBdr>
+        <w:spacing w:after="60" w:before="0" w:line="20" w:lineRule="exact"/>
+      </w:pPr>
+      <w:r>
+        <w:rPr>
+          <w:rFonts w:ascii="Open Sans" w:hAnsi="Open Sans" w:cs="Open Sans"/>
+          <w:b w:val="0"/>
+          <w:i w:val="0"/>
+          <w:color w:val="333333"/>
+          <w:sz w:val="2"/>
+          <w:u w:val="none"/>
+        </w:rPr>
+      </w:r>
+    </w:p>
+    <w:p>
+      <w:pPr>
+        <w:spacing w:after="80" w:before="0"/>
+      </w:pPr>
+      <w:r>
+        <w:rPr>
+          <w:rFonts w:ascii="Open Sans" w:hAnsi="Open Sans" w:cs="Open Sans"/>
+          <w:b/>
+          <w:i w:val="0"/>
+          <w:color w:val="333333"/>
+          <w:sz w:val="20"/>
+          <w:u w:val="none"/>
+        </w:rPr>
+        <w:t>$ 1,260.00</w:t>
       </w:r>
     </w:p>
     <w:p>

</xml_diff>

<commit_message>
refactor: improve docx generation layout by reordering daily food service totals and adding currency formatting tests
</commit_message>
<xml_diff>
--- a/REFACTOR_TEST_RESULT.docx
+++ b/REFACTOR_TEST_RESULT.docx
@@ -1235,22 +1235,6 @@
     </w:p>
     <w:p>
       <w:pPr>
-        <w:spacing w:after="80" w:before="0"/>
-      </w:pPr>
-      <w:r>
-        <w:rPr>
-          <w:rFonts w:ascii="Open Sans" w:hAnsi="Open Sans" w:cs="Open Sans"/>
-          <w:b/>
-          <w:i w:val="0"/>
-          <w:color w:val="333333"/>
-          <w:sz w:val="20"/>
-          <w:u w:val="none"/>
-        </w:rPr>
-        <w:t>$ 420.00</w:t>
-      </w:r>
-    </w:p>
-    <w:p>
-      <w:pPr>
         <w:tabs>
           <w:tab w:pos="9354" w:val="right"/>
         </w:tabs>
@@ -1272,6 +1256,39 @@
           <w:sz w:val="20"/>
         </w:rPr>
         <w:t>Seafood Options</w:t>
+      </w:r>
+      <w:r>
+        <w:rPr>
+          <w:rFonts w:ascii="Open Sans" w:hAnsi="Open Sans" w:cs="Open Sans"/>
+          <w:sz w:val="20"/>
+        </w:rPr>
+        <w:tab/>
+      </w:r>
+      <w:r>
+        <w:rPr>
+          <w:rFonts w:ascii="Open Sans" w:hAnsi="Open Sans" w:cs="Open Sans"/>
+          <w:b w:val="0"/>
+          <w:sz w:val="20"/>
+        </w:rPr>
+        <w:t>$ 420.00</w:t>
+      </w:r>
+    </w:p>
+    <w:p>
+      <w:pPr>
+        <w:tabs>
+          <w:tab w:pos="9354" w:val="right"/>
+        </w:tabs>
+        <w:spacing w:after="80" w:before="0"/>
+      </w:pPr>
+      <w:r>
+        <w:rPr>
+          <w:rFonts w:ascii="Open Sans" w:hAnsi="Open Sans" w:cs="Open Sans"/>
+          <w:b w:val="0"/>
+          <w:i w:val="0"/>
+          <w:color w:val="333333"/>
+          <w:sz w:val="20"/>
+          <w:u w:val="none"/>
+        </w:rPr>
       </w:r>
       <w:r>
         <w:rPr>
@@ -1324,22 +1341,6 @@
     </w:p>
     <w:p>
       <w:pPr>
-        <w:spacing w:after="80" w:before="0"/>
-      </w:pPr>
-      <w:r>
-        <w:rPr>
-          <w:rFonts w:ascii="Open Sans" w:hAnsi="Open Sans" w:cs="Open Sans"/>
-          <w:b/>
-          <w:i w:val="0"/>
-          <w:color w:val="333333"/>
-          <w:sz w:val="20"/>
-          <w:u w:val="none"/>
-        </w:rPr>
-        <w:t>$ 1,260.00</w:t>
-      </w:r>
-    </w:p>
-    <w:p>
-      <w:pPr>
         <w:tabs>
           <w:tab w:pos="9354" w:val="right"/>
         </w:tabs>
@@ -1361,6 +1362,39 @@
           <w:sz w:val="20"/>
         </w:rPr>
         <w:t>Main Course Selection</w:t>
+      </w:r>
+      <w:r>
+        <w:rPr>
+          <w:rFonts w:ascii="Open Sans" w:hAnsi="Open Sans" w:cs="Open Sans"/>
+          <w:sz w:val="20"/>
+        </w:rPr>
+        <w:tab/>
+      </w:r>
+      <w:r>
+        <w:rPr>
+          <w:rFonts w:ascii="Open Sans" w:hAnsi="Open Sans" w:cs="Open Sans"/>
+          <w:b w:val="0"/>
+          <w:sz w:val="20"/>
+        </w:rPr>
+        <w:t>$ 1,260.00</w:t>
+      </w:r>
+    </w:p>
+    <w:p>
+      <w:pPr>
+        <w:tabs>
+          <w:tab w:pos="9354" w:val="right"/>
+        </w:tabs>
+        <w:spacing w:after="80" w:before="0"/>
+      </w:pPr>
+      <w:r>
+        <w:rPr>
+          <w:rFonts w:ascii="Open Sans" w:hAnsi="Open Sans" w:cs="Open Sans"/>
+          <w:b w:val="0"/>
+          <w:i w:val="0"/>
+          <w:color w:val="333333"/>
+          <w:sz w:val="20"/>
+          <w:u w:val="none"/>
+        </w:rPr>
       </w:r>
       <w:r>
         <w:rPr>

</xml_diff>